<commit_message>
fix(writer): joiners of other scripts are text, code is not proofed
The maintainer's decisions on the review of 0.3.0. B-D1: U+200C and
U+200D between two letters of a complex script other than Thai are
taken, written in the run of the word they join, and not reported.
B-D2: code with no complex script carries <w:noProof/>; check and
repair leave it there and nowhere else. B-D3: limits.md and ADR 0036
say an accessible document is built with --auto-numbering.
Every golden moves: <w:noProof/> on its code runs, nothing else.

Signed-off-by: Sayam Sriphua <976721+sayam@users.noreply.github.com>
</commit_message>
<xml_diff>
--- a/tests/golden/sample-all-flags.docx
+++ b/tests/golden/sample-all-flags.docx
@@ -267,6 +267,7 @@
       <w:r>
         <w:rPr>
           <w:rFonts w:ascii="Consolas" w:hAnsi="Consolas" w:cs="TH Sarabun New"/>
+          <w:noProof/>
         </w:rPr>
         <w:t xml:space="preserve">Ctrl</w:t>
       </w:r>
@@ -308,6 +309,7 @@
       <w:r>
         <w:rPr>
           <w:rFonts w:ascii="Consolas" w:hAnsi="Consolas" w:cs="TH Sarabun New"/>
+          <w:noProof/>
         </w:rPr>
         <w:t xml:space="preserve">code span</w:t>
       </w:r>
@@ -708,6 +710,9 @@
         <w:pStyle w:val="CodeBlock"/>
       </w:pPr>
       <w:r>
+        <w:rPr>
+          <w:noProof/>
+        </w:rPr>
         <w:t xml:space="preserve">def </w:t>
       </w:r>
       <w:r>
@@ -717,6 +722,9 @@
         <w:t xml:space="preserve">สวัสดี</w:t>
       </w:r>
       <w:r>
+        <w:rPr>
+          <w:noProof/>
+        </w:rPr>
         <w:t xml:space="preserve">():  # comment </w:t>
       </w:r>
       <w:r>
@@ -731,6 +739,9 @@
         <w:pStyle w:val="CodeBlock"/>
       </w:pPr>
       <w:r>
+        <w:rPr>
+          <w:noProof/>
+        </w:rPr>
         <w:t xml:space="preserve">    return "hello &amp; &lt;world&gt;"</w:t>
       </w:r>
     </w:p>
@@ -739,6 +750,9 @@
         <w:pStyle w:val="CodeBlock"/>
       </w:pPr>
       <w:r>
+        <w:rPr>
+          <w:noProof/>
+        </w:rPr>
         <w:t xml:space="preserve">indented code block</w:t>
       </w:r>
     </w:p>
@@ -753,6 +767,7 @@
       <w:r>
         <w:rPr>
           <w:rFonts w:ascii="Consolas" w:hAnsi="Consolas" w:cs="TH Sarabun New"/>
+          <w:noProof/>
         </w:rPr>
         <w:t xml:space="preserve">E = mc^2</w:t>
       </w:r>
@@ -768,6 +783,9 @@
         <w:pStyle w:val="CodeBlock"/>
       </w:pPr>
       <w:r>
+        <w:rPr>
+          <w:noProof/>
+        </w:rPr>
         <w:t xml:space="preserve">\int_0^1 x\,dx</w:t>
       </w:r>
     </w:p>

</xml_diff>

<commit_message>
fix(writer): Normal repeats the paragraph defaults
An application that reads styles but not w:docDefaults took the font and
size from Normal, which repeats them, but not the spacing after a
paragraph, the line spacing or Thai distributed, which only
w:pPrDefault said. Normal now carries the same w:pPr.

Every golden moves in word/styles.xml, in the Normal style only; the
goldens are read again before the release.

Signed-off-by: Sayam Sriphua <976721+sayam@users.noreply.github.com>
</commit_message>
<xml_diff>
--- a/tests/golden/sample-all-flags.docx
+++ b/tests/golden/sample-all-flags.docx
@@ -1155,6 +1155,10 @@
   <w:style w:type="paragraph" w:default="1" w:styleId="Normal">
     <w:name w:val="Normal"/>
     <w:qFormat/>
+    <w:pPr>
+      <w:spacing w:after="120" w:line="240" w:lineRule="auto"/>
+      <w:jc w:val="thaiDistribute"/>
+    </w:pPr>
     <w:rPr>
       <w:rFonts w:ascii="TH Sarabun New" w:hAnsi="TH Sarabun New" w:cs="TH Sarabun New" w:eastAsia="TH Sarabun New"/>
       <w:sz w:val="30"/>

</xml_diff>